<commit_message>
mise à jour + évolution
</commit_message>
<xml_diff>
--- a/pourquoi_nouvel_outil.docx
+++ b/pourquoi_nouvel_outil.docx
@@ -39,14 +39,27 @@
     <w:p>
       <w:pPr>
         <w:pStyle w:val="Normal"/>
-        <w:pBdr>
-          <w:bottom w:val="single" w:sz="6" w:space="8" w:color="E5DFCF"/>
-        </w:pBdr>
-        <w:spacing w:before="200" w:after="300"/>
-        <w:rPr/>
-      </w:pPr>
-      <w:r>
-        <w:rPr/>
+        <w:spacing w:before="0" w:after="140"/>
+        <w:rPr/>
+      </w:pPr>
+      <w:r>
+        <w:rPr/>
+        <w:t>Dès lundi 31 août 2026</w:t>
+      </w:r>
+      <w:r>
+        <w:rPr/>
+        <w:t>, le pointage se fera sur une interface web plutôt que sur le fichier Excel qu'on utilisait jusque-là. Voici, en quelques mots, pourquoi ce changement — et ce qu'il change concrètement pour toi.</w:t>
+      </w:r>
+    </w:p>
+    <w:p>
+      <w:pPr>
+        <w:pStyle w:val="Heading2"/>
+        <w:spacing w:before="280" w:after="120"/>
+        <w:rPr/>
+      </w:pPr>
+      <w:r>
+        <w:rPr/>
+        <w:t>Une question de continuité, aussi !</w:t>
       </w:r>
     </w:p>
     <w:p>
@@ -57,39 +70,31 @@
       </w:pPr>
       <w:r>
         <w:rPr/>
-        <w:t>Da</w:t>
-      </w:r>
-      <w:r>
-        <w:rPr/>
-        <w:t>ns</w:t>
-      </w:r>
-      <w:r>
-        <w:rPr/>
-        <w:t xml:space="preserve"> quelques </w:t>
-      </w:r>
-      <w:r>
-        <w:rPr/>
-        <w:t>jours</w:t>
-      </w:r>
-      <w:r>
-        <w:rPr/>
-        <w:t xml:space="preserve">, le pointage se </w:t>
-      </w:r>
-      <w:r>
-        <w:rPr/>
-        <w:t>fera</w:t>
-      </w:r>
-      <w:r>
-        <w:rPr/>
-        <w:t xml:space="preserve"> sur une </w:t>
-      </w:r>
-      <w:r>
-        <w:rPr/>
-        <w:t>interface web</w:t>
-      </w:r>
-      <w:r>
-        <w:rPr/>
-        <w:t xml:space="preserve"> plutôt que sur le fichier Excel qu'on utilisait jusque-là. Voici, en quelques mots, pourquoi ce changement — et ce qu'il change concrètement pour toi.</w:t>
+        <w:t>J</w:t>
+      </w:r>
+      <w:r>
+        <w:rPr/>
+        <w:t xml:space="preserve">e ne </w:t>
+      </w:r>
+      <w:r>
+        <w:rPr/>
+        <w:t>souhaitais</w:t>
+      </w:r>
+      <w:r>
+        <w:rPr/>
+        <w:t xml:space="preserve"> pas maintenir éternellement cet outil </w:t>
+      </w:r>
+      <w:r>
+        <w:rPr/>
+        <w:t>basé sur excel (et macros)</w:t>
+      </w:r>
+      <w:r>
+        <w:rPr/>
+        <w:t xml:space="preserve">, et l'association ne doit pas dépendre d'une seule personne — ni d'un seul fichier posé sur un seul ordinateur. En construisant ce nouveau système sur de vraies fondations (sauvegardes automatiques, code documenté et partagé), je souhaite laisser à la Banque Alimentaire quelque chose de fiable, que quelqu'un d'autre pourra reprendre et faire vivre après moi, sans repartir de zéro. </w:t>
+      </w:r>
+      <w:r>
+        <w:rPr/>
+        <w:t xml:space="preserve">Ce nouvel outil peut être également assez aisément déployable ailleurs. </w:t>
       </w:r>
     </w:p>
     <w:p>
@@ -100,7 +105,7 @@
       </w:pPr>
       <w:r>
         <w:rPr/>
-        <w:t>Une question de continuité, aussi !</w:t>
+        <w:t xml:space="preserve">Le fichier Excel devenait fragile </w:t>
       </w:r>
     </w:p>
     <w:p>
@@ -111,64 +116,15 @@
       </w:pPr>
       <w:r>
         <w:rPr/>
-        <w:t>L</w:t>
-      </w:r>
-      <w:r>
-        <w:rPr/>
-        <w:t>es années passent et j</w:t>
-      </w:r>
-      <w:r>
-        <w:rPr/>
-        <w:t xml:space="preserve">e ne serai pas éternellement derrière cet outil </w:t>
-      </w:r>
-      <w:r>
-        <w:rPr/>
-        <w:t>pour le maintenir</w:t>
-      </w:r>
-      <w:r>
-        <w:rPr/>
-        <w:t xml:space="preserve">, et l'association ne doit pas dépendre d'une seule personne — ni d'un seul fichier posé sur un seul ordinateur. En construisant ce </w:t>
-      </w:r>
-      <w:r>
-        <w:rPr/>
-        <w:t xml:space="preserve">nouveau </w:t>
-      </w:r>
-      <w:r>
-        <w:rPr/>
-        <w:t xml:space="preserve">système sur de vraies fondations (sauvegardes automatiques, code documenté et partagé), je </w:t>
-      </w:r>
-      <w:r>
-        <w:rPr/>
-        <w:t>souhaite</w:t>
-      </w:r>
-      <w:r>
-        <w:rPr/>
-        <w:t xml:space="preserve"> laisser à la Banque Alimentaire quelque chose de fiable, que quelqu'un d'autre pourra reprendre et faire vivre après moi, sans repartir de zéro.</w:t>
-      </w:r>
-    </w:p>
-    <w:p>
-      <w:pPr>
-        <w:pStyle w:val="Heading2"/>
-        <w:spacing w:before="280" w:after="120"/>
-        <w:rPr/>
-      </w:pPr>
-      <w:r>
-        <w:rPr/>
-        <w:t xml:space="preserve">Le fichier Excel devenait fragile </w:t>
-      </w:r>
-    </w:p>
-    <w:p>
-      <w:pPr>
-        <w:pStyle w:val="Normal"/>
-        <w:spacing w:before="0" w:after="140"/>
-        <w:rPr/>
-      </w:pPr>
-      <w:r>
-        <w:rPr/>
         <w:t xml:space="preserve">L'ancien système reposait sur un seul fichier, sur un seul ordinateur. Une panne, une mauvaise manipulation, un fichier corrompu — et des mois de présences, de kilomètres, d'heures pouvaient être perdus d'un coup, sans aucun moyen de les récupérer. </w:t>
       </w:r>
       <w:r>
-        <w:rPr/>
+        <w:rPr>
+          <w:b/>
+          <w:bCs/>
+          <w:i/>
+          <w:iCs/>
+        </w:rPr>
         <w:t>Le système était difficilement maintenable !</w:t>
       </w:r>
     </w:p>
@@ -177,7 +133,7 @@
         <w:pStyle w:val="ListParagraph"/>
         <w:numPr>
           <w:ilvl w:val="0"/>
-          <w:numId w:val="3"/>
+          <w:numId w:val="4"/>
         </w:numPr>
         <w:spacing w:before="0" w:after="100"/>
         <w:rPr>
@@ -199,7 +155,7 @@
         <w:pStyle w:val="ListParagraph"/>
         <w:numPr>
           <w:ilvl w:val="0"/>
-          <w:numId w:val="1"/>
+          <w:numId w:val="5"/>
         </w:numPr>
         <w:spacing w:before="0" w:after="100"/>
         <w:rPr/>
@@ -236,7 +192,7 @@
         <w:pStyle w:val="ListParagraph"/>
         <w:numPr>
           <w:ilvl w:val="0"/>
-          <w:numId w:val="1"/>
+          <w:numId w:val="6"/>
         </w:numPr>
         <w:spacing w:before="0" w:after="100"/>
         <w:rPr/>
@@ -251,7 +207,7 @@
         <w:pStyle w:val="ListParagraph"/>
         <w:numPr>
           <w:ilvl w:val="0"/>
-          <w:numId w:val="1"/>
+          <w:numId w:val="7"/>
         </w:numPr>
         <w:spacing w:before="0" w:after="100"/>
         <w:rPr/>
@@ -306,7 +262,7 @@
         <w:pStyle w:val="ListParagraph"/>
         <w:numPr>
           <w:ilvl w:val="0"/>
-          <w:numId w:val="1"/>
+          <w:numId w:val="8"/>
         </w:numPr>
         <w:spacing w:before="0" w:after="100"/>
         <w:rPr/>
@@ -321,7 +277,7 @@
         <w:pStyle w:val="ListParagraph"/>
         <w:numPr>
           <w:ilvl w:val="0"/>
-          <w:numId w:val="1"/>
+          <w:numId w:val="9"/>
         </w:numPr>
         <w:spacing w:before="0" w:after="100"/>
         <w:rPr/>
@@ -358,7 +314,7 @@
         <w:pStyle w:val="ListParagraph"/>
         <w:numPr>
           <w:ilvl w:val="0"/>
-          <w:numId w:val="1"/>
+          <w:numId w:val="10"/>
         </w:numPr>
         <w:spacing w:before="0" w:after="100"/>
         <w:rPr/>
@@ -373,7 +329,7 @@
         <w:pStyle w:val="ListParagraph"/>
         <w:numPr>
           <w:ilvl w:val="0"/>
-          <w:numId w:val="1"/>
+          <w:numId w:val="11"/>
         </w:numPr>
         <w:spacing w:before="0" w:after="100"/>
         <w:rPr/>
@@ -476,6 +432,7 @@
         </w:tabs>
         <w:ind w:start="1080" w:hanging="360"/>
       </w:pPr>
+      <w:rPr/>
     </w:lvl>
     <w:lvl w:ilvl="2">
       <w:start w:val="1"/>
@@ -488,6 +445,7 @@
         </w:tabs>
         <w:ind w:start="1440" w:hanging="360"/>
       </w:pPr>
+      <w:rPr/>
     </w:lvl>
     <w:lvl w:ilvl="3">
       <w:start w:val="1"/>
@@ -500,6 +458,7 @@
         </w:tabs>
         <w:ind w:start="1800" w:hanging="360"/>
       </w:pPr>
+      <w:rPr/>
     </w:lvl>
     <w:lvl w:ilvl="4">
       <w:start w:val="1"/>
@@ -512,6 +471,7 @@
         </w:tabs>
         <w:ind w:start="2160" w:hanging="360"/>
       </w:pPr>
+      <w:rPr/>
     </w:lvl>
     <w:lvl w:ilvl="5">
       <w:start w:val="1"/>
@@ -524,6 +484,7 @@
         </w:tabs>
         <w:ind w:start="2520" w:hanging="360"/>
       </w:pPr>
+      <w:rPr/>
     </w:lvl>
     <w:lvl w:ilvl="6">
       <w:start w:val="1"/>
@@ -536,6 +497,7 @@
         </w:tabs>
         <w:ind w:start="2880" w:hanging="360"/>
       </w:pPr>
+      <w:rPr/>
     </w:lvl>
     <w:lvl w:ilvl="7">
       <w:start w:val="1"/>
@@ -548,6 +510,7 @@
         </w:tabs>
         <w:ind w:start="3240" w:hanging="360"/>
       </w:pPr>
+      <w:rPr/>
     </w:lvl>
     <w:lvl w:ilvl="8">
       <w:start w:val="1"/>
@@ -560,9 +523,131 @@
         </w:tabs>
         <w:ind w:start="3600" w:hanging="360"/>
       </w:pPr>
+      <w:rPr/>
     </w:lvl>
   </w:abstractNum>
   <w:abstractNum w:abstractNumId="2">
+    <w:lvl w:ilvl="0">
+      <w:start w:val="1"/>
+      <w:numFmt w:val="bullet"/>
+      <w:lvlText w:val=""/>
+      <w:lvlJc w:val="start"/>
+      <w:pPr>
+        <w:tabs>
+          <w:tab w:val="num" w:pos="0"/>
+        </w:tabs>
+        <w:ind w:start="360" w:hanging="260"/>
+      </w:pPr>
+      <w:rPr>
+        <w:rFonts w:ascii="Symbol" w:hAnsi="Symbol" w:cs="Symbol" w:hint="default"/>
+      </w:rPr>
+    </w:lvl>
+    <w:lvl w:ilvl="1">
+      <w:start w:val="1"/>
+      <w:numFmt w:val="decimal"/>
+      <w:lvlText w:val="%2."/>
+      <w:lvlJc w:val="start"/>
+      <w:pPr>
+        <w:tabs>
+          <w:tab w:val="num" w:pos="1080"/>
+        </w:tabs>
+        <w:ind w:start="1080" w:hanging="360"/>
+      </w:pPr>
+      <w:rPr/>
+    </w:lvl>
+    <w:lvl w:ilvl="2">
+      <w:start w:val="1"/>
+      <w:numFmt w:val="decimal"/>
+      <w:lvlText w:val="%3."/>
+      <w:lvlJc w:val="start"/>
+      <w:pPr>
+        <w:tabs>
+          <w:tab w:val="num" w:pos="1440"/>
+        </w:tabs>
+        <w:ind w:start="1440" w:hanging="360"/>
+      </w:pPr>
+      <w:rPr/>
+    </w:lvl>
+    <w:lvl w:ilvl="3">
+      <w:start w:val="1"/>
+      <w:numFmt w:val="decimal"/>
+      <w:lvlText w:val="%4."/>
+      <w:lvlJc w:val="start"/>
+      <w:pPr>
+        <w:tabs>
+          <w:tab w:val="num" w:pos="1800"/>
+        </w:tabs>
+        <w:ind w:start="1800" w:hanging="360"/>
+      </w:pPr>
+      <w:rPr/>
+    </w:lvl>
+    <w:lvl w:ilvl="4">
+      <w:start w:val="1"/>
+      <w:numFmt w:val="decimal"/>
+      <w:lvlText w:val="%5."/>
+      <w:lvlJc w:val="start"/>
+      <w:pPr>
+        <w:tabs>
+          <w:tab w:val="num" w:pos="2160"/>
+        </w:tabs>
+        <w:ind w:start="2160" w:hanging="360"/>
+      </w:pPr>
+      <w:rPr/>
+    </w:lvl>
+    <w:lvl w:ilvl="5">
+      <w:start w:val="1"/>
+      <w:numFmt w:val="decimal"/>
+      <w:lvlText w:val="%6."/>
+      <w:lvlJc w:val="start"/>
+      <w:pPr>
+        <w:tabs>
+          <w:tab w:val="num" w:pos="2520"/>
+        </w:tabs>
+        <w:ind w:start="2520" w:hanging="360"/>
+      </w:pPr>
+      <w:rPr/>
+    </w:lvl>
+    <w:lvl w:ilvl="6">
+      <w:start w:val="1"/>
+      <w:numFmt w:val="decimal"/>
+      <w:lvlText w:val="%7."/>
+      <w:lvlJc w:val="start"/>
+      <w:pPr>
+        <w:tabs>
+          <w:tab w:val="num" w:pos="2880"/>
+        </w:tabs>
+        <w:ind w:start="2880" w:hanging="360"/>
+      </w:pPr>
+      <w:rPr/>
+    </w:lvl>
+    <w:lvl w:ilvl="7">
+      <w:start w:val="1"/>
+      <w:numFmt w:val="decimal"/>
+      <w:lvlText w:val="%8."/>
+      <w:lvlJc w:val="start"/>
+      <w:pPr>
+        <w:tabs>
+          <w:tab w:val="num" w:pos="3240"/>
+        </w:tabs>
+        <w:ind w:start="3240" w:hanging="360"/>
+      </w:pPr>
+      <w:rPr/>
+    </w:lvl>
+    <w:lvl w:ilvl="8">
+      <w:start w:val="1"/>
+      <w:numFmt w:val="decimal"/>
+      <w:lvlText w:val="%9."/>
+      <w:lvlJc w:val="start"/>
+      <w:pPr>
+        <w:tabs>
+          <w:tab w:val="num" w:pos="3600"/>
+        </w:tabs>
+        <w:ind w:start="3600" w:hanging="360"/>
+      </w:pPr>
+      <w:rPr/>
+    </w:lvl>
+  </w:abstractNum>
+  <w:abstractNum w:abstractNumId="3">
     <w:lvl w:ilvl="0">
       <w:start w:val="1"/>
       <w:numFmt w:val="none"/>
@@ -688,10 +773,34 @@
     <w:abstractNumId w:val="2"/>
   </w:num>
   <w:num w:numId="3">
-    <w:abstractNumId w:val="1"/>
+    <w:abstractNumId w:val="3"/>
+  </w:num>
+  <w:num w:numId="4">
+    <w:abstractNumId w:val="2"/>
     <w:lvlOverride w:ilvl="0">
       <w:startOverride w:val="1"/>
     </w:lvlOverride>
+  </w:num>
+  <w:num w:numId="5">
+    <w:abstractNumId w:val="2"/>
+  </w:num>
+  <w:num w:numId="6">
+    <w:abstractNumId w:val="2"/>
+  </w:num>
+  <w:num w:numId="7">
+    <w:abstractNumId w:val="2"/>
+  </w:num>
+  <w:num w:numId="8">
+    <w:abstractNumId w:val="2"/>
+  </w:num>
+  <w:num w:numId="9">
+    <w:abstractNumId w:val="2"/>
+  </w:num>
+  <w:num w:numId="10">
+    <w:abstractNumId w:val="2"/>
+  </w:num>
+  <w:num w:numId="11">
+    <w:abstractNumId w:val="2"/>
   </w:num>
 </w:numbering>
 </file>
@@ -716,6 +825,7 @@
     <w:qFormat/>
     <w:pPr>
       <w:widowControl/>
+      <w:suppressAutoHyphens w:val="true"/>
       <w:bidi w:val="0"/>
       <w:spacing w:before="0" w:after="0"/>
       <w:jc w:val="start"/>
@@ -808,11 +918,18 @@
       <w:u w:val="single"/>
     </w:rPr>
   </w:style>
-  <w:style w:type="character" w:styleId="FootnoteCharacters">
-    <w:name w:val="Footnote Characters"/>
+  <w:style w:type="character" w:styleId="FootnoteCharactersuser">
+    <w:name w:val="Footnote Characters (user)"/>
     <w:uiPriority w:val="99"/>
     <w:semiHidden/>
     <w:unhideWhenUsed/>
+    <w:qFormat/>
+    <w:rPr>
+      <w:vertAlign w:val="superscript"/>
+    </w:rPr>
+  </w:style>
+  <w:style w:type="character" w:styleId="FootnoteCharacters">
+    <w:name w:val="Footnote Characters"/>
     <w:qFormat/>
     <w:rPr>
       <w:vertAlign w:val="superscript"/>
@@ -836,11 +953,18 @@
       <w:szCs w:val="20"/>
     </w:rPr>
   </w:style>
-  <w:style w:type="character" w:styleId="EndnoteCharacters">
-    <w:name w:val="Endnote Characters"/>
+  <w:style w:type="character" w:styleId="EndnoteCharactersuser">
+    <w:name w:val="Endnote Characters (user)"/>
     <w:uiPriority w:val="99"/>
     <w:semiHidden/>
     <w:unhideWhenUsed/>
+    <w:qFormat/>
+    <w:rPr>
+      <w:vertAlign w:val="superscript"/>
+    </w:rPr>
+  </w:style>
+  <w:style w:type="character" w:styleId="EndnoteCharacters">
+    <w:name w:val="Endnote Characters"/>
     <w:qFormat/>
     <w:rPr>
       <w:vertAlign w:val="superscript"/>
@@ -937,6 +1061,7 @@
     <w:qFormat/>
     <w:pPr>
       <w:widowControl/>
+      <w:suppressAutoHyphens w:val="true"/>
       <w:bidi w:val="0"/>
       <w:spacing w:before="0" w:after="0"/>
       <w:jc w:val="start"/>
@@ -957,6 +1082,7 @@
     <w:qFormat/>
     <w:pPr>
       <w:widowControl/>
+      <w:suppressAutoHyphens w:val="true"/>
       <w:bidi w:val="0"/>
       <w:spacing w:before="0" w:after="0"/>
       <w:jc w:val="start"/>

</xml_diff>